<commit_message>
Changes in SQL files
</commit_message>
<xml_diff>
--- a/SQL/SQL_practise.docx
+++ b/SQL/SQL_practise.docx
@@ -4,11 +4,305 @@
   <w:body>
     <w:p>
       <w:r>
-        <w:t>URL = https://www.sql-practice.com/</w:t>
-      </w:r>
-      <w:r>
-        <w:br/>
-        <w:t>Database = hospital.db</w:t>
+        <w:t xml:space="preserve">URL = </w:t>
+      </w:r>
+      <w:hyperlink r:id="rId5" w:history="1">
+        <w:r>
+          <w:rPr>
+            <w:rStyle w:val="Hyperlink"/>
+          </w:rPr>
+          <w:t>https://www.sql-practice.com/</w:t>
+        </w:r>
+      </w:hyperlink>
+    </w:p>
+    <w:p>
+      <w:r>
+        <w:t xml:space="preserve">Database = </w:t>
+      </w:r>
+      <w:proofErr w:type="spellStart"/>
+      <w:r>
+        <w:t>hospital.db</w:t>
+      </w:r>
+      <w:proofErr w:type="spellEnd"/>
+    </w:p>
+    <w:p>
+      <w:pPr>
+        <w:rPr>
+          <w:b/>
+          <w:bCs/>
+        </w:rPr>
+      </w:pPr>
+      <w:r>
+        <w:rPr>
+          <w:b/>
+          <w:bCs/>
+        </w:rPr>
+        <w:t xml:space="preserve">Concepts Covered </w:t>
+      </w:r>
+    </w:p>
+    <w:p>
+      <w:pPr>
+        <w:pStyle w:val="ListParagraph"/>
+        <w:numPr>
+          <w:ilvl w:val="0"/>
+          <w:numId w:val="7"/>
+        </w:numPr>
+      </w:pPr>
+      <w:r>
+        <w:t>Us</w:t>
+      </w:r>
+      <w:r>
+        <w:t>ed</w:t>
+      </w:r>
+      <w:r>
+        <w:t xml:space="preserve"> comparison operators (=, &gt;, &lt;, &gt;=, &lt;=)</w:t>
+      </w:r>
+    </w:p>
+    <w:p>
+      <w:pPr>
+        <w:pStyle w:val="ListParagraph"/>
+        <w:numPr>
+          <w:ilvl w:val="0"/>
+          <w:numId w:val="7"/>
+        </w:numPr>
+      </w:pPr>
+      <w:r>
+        <w:t>Us</w:t>
+      </w:r>
+      <w:r>
+        <w:t>ed</w:t>
+      </w:r>
+      <w:r>
+        <w:t xml:space="preserve"> IN, BETWEEN, LIKE, IS NULL</w:t>
+      </w:r>
+      <w:r>
+        <w:t xml:space="preserve">, </w:t>
+      </w:r>
+      <w:r>
+        <w:t>DISTINCT</w:t>
+      </w:r>
+      <w:r>
+        <w:t xml:space="preserve">, </w:t>
+      </w:r>
+      <w:proofErr w:type="gramStart"/>
+      <w:r>
+        <w:t>WHERE</w:t>
+      </w:r>
+      <w:proofErr w:type="gramEnd"/>
+      <w:r>
+        <w:t>, GROUP BY,</w:t>
+      </w:r>
+      <w:r>
+        <w:t xml:space="preserve"> ORDER BY</w:t>
+      </w:r>
+      <w:r>
+        <w:t>, HAVING</w:t>
+      </w:r>
+    </w:p>
+    <w:p>
+      <w:pPr>
+        <w:pStyle w:val="ListParagraph"/>
+        <w:numPr>
+          <w:ilvl w:val="0"/>
+          <w:numId w:val="7"/>
+        </w:numPr>
+      </w:pPr>
+      <w:r>
+        <w:t xml:space="preserve">Used </w:t>
+      </w:r>
+      <w:r>
+        <w:t xml:space="preserve">JOIN, </w:t>
+      </w:r>
+      <w:r>
+        <w:t xml:space="preserve">UNION, UNION ALL, </w:t>
+      </w:r>
+      <w:r>
+        <w:t>SUBQUERY, CASE WHEN … THEN … END</w:t>
+      </w:r>
+      <w:r>
+        <w:t xml:space="preserve">, </w:t>
+      </w:r>
+      <w:proofErr w:type="gramStart"/>
+      <w:r>
+        <w:t>LAG(</w:t>
+      </w:r>
+      <w:proofErr w:type="gramEnd"/>
+      <w:r>
+        <w:t>)</w:t>
+      </w:r>
+    </w:p>
+    <w:p>
+      <w:pPr>
+        <w:pStyle w:val="ListParagraph"/>
+        <w:numPr>
+          <w:ilvl w:val="0"/>
+          <w:numId w:val="7"/>
+        </w:numPr>
+      </w:pPr>
+      <w:r>
+        <w:t xml:space="preserve">String function - </w:t>
+      </w:r>
+      <w:proofErr w:type="gramStart"/>
+      <w:r>
+        <w:t>CONCAT(</w:t>
+      </w:r>
+      <w:proofErr w:type="gramEnd"/>
+      <w:r>
+        <w:t>)</w:t>
+      </w:r>
+      <w:r>
+        <w:t xml:space="preserve">, </w:t>
+      </w:r>
+      <w:proofErr w:type="gramStart"/>
+      <w:r>
+        <w:t>UPPER(</w:t>
+      </w:r>
+      <w:proofErr w:type="gramEnd"/>
+      <w:r>
+        <w:t xml:space="preserve">), </w:t>
+      </w:r>
+      <w:proofErr w:type="gramStart"/>
+      <w:r>
+        <w:t>LOWER(</w:t>
+      </w:r>
+      <w:proofErr w:type="gramEnd"/>
+      <w:r>
+        <w:t>)</w:t>
+      </w:r>
+      <w:r>
+        <w:t xml:space="preserve">, </w:t>
+      </w:r>
+      <w:proofErr w:type="gramStart"/>
+      <w:r>
+        <w:t>LEN(</w:t>
+      </w:r>
+      <w:proofErr w:type="gramEnd"/>
+      <w:r>
+        <w:t xml:space="preserve">) or </w:t>
+      </w:r>
+      <w:proofErr w:type="gramStart"/>
+      <w:r>
+        <w:t>LENGTH(</w:t>
+      </w:r>
+      <w:proofErr w:type="gramEnd"/>
+      <w:r>
+        <w:t>)</w:t>
+      </w:r>
+    </w:p>
+    <w:p>
+      <w:pPr>
+        <w:pStyle w:val="ListParagraph"/>
+        <w:numPr>
+          <w:ilvl w:val="0"/>
+          <w:numId w:val="7"/>
+        </w:numPr>
+      </w:pPr>
+      <w:r>
+        <w:t xml:space="preserve">Aggregated function - </w:t>
+      </w:r>
+      <w:proofErr w:type="gramStart"/>
+      <w:r>
+        <w:t>COUNT(</w:t>
+      </w:r>
+      <w:proofErr w:type="gramEnd"/>
+      <w:r>
+        <w:t xml:space="preserve">), </w:t>
+      </w:r>
+      <w:proofErr w:type="gramStart"/>
+      <w:r>
+        <w:t>MAX(</w:t>
+      </w:r>
+      <w:proofErr w:type="gramEnd"/>
+      <w:r>
+        <w:t xml:space="preserve">), </w:t>
+      </w:r>
+      <w:proofErr w:type="gramStart"/>
+      <w:r>
+        <w:t>MIN(</w:t>
+      </w:r>
+      <w:proofErr w:type="gramEnd"/>
+      <w:r>
+        <w:t xml:space="preserve">), </w:t>
+      </w:r>
+      <w:proofErr w:type="gramStart"/>
+      <w:r>
+        <w:t>SUM(</w:t>
+      </w:r>
+      <w:proofErr w:type="gramEnd"/>
+      <w:r>
+        <w:t xml:space="preserve">), </w:t>
+      </w:r>
+      <w:proofErr w:type="gramStart"/>
+      <w:r>
+        <w:t>AVG(</w:t>
+      </w:r>
+      <w:proofErr w:type="gramEnd"/>
+      <w:r>
+        <w:t>)</w:t>
+      </w:r>
+    </w:p>
+    <w:p>
+      <w:pPr>
+        <w:pStyle w:val="ListParagraph"/>
+        <w:numPr>
+          <w:ilvl w:val="0"/>
+          <w:numId w:val="7"/>
+        </w:numPr>
+      </w:pPr>
+      <w:r>
+        <w:t xml:space="preserve">Date function – </w:t>
+      </w:r>
+      <w:proofErr w:type="gramStart"/>
+      <w:r>
+        <w:t>YEAR(</w:t>
+      </w:r>
+      <w:proofErr w:type="gramEnd"/>
+      <w:r>
+        <w:t xml:space="preserve">), </w:t>
+      </w:r>
+      <w:proofErr w:type="gramStart"/>
+      <w:r>
+        <w:t>DAY(</w:t>
+      </w:r>
+      <w:proofErr w:type="gramEnd"/>
+      <w:r>
+        <w:t xml:space="preserve">), </w:t>
+      </w:r>
+      <w:proofErr w:type="gramStart"/>
+      <w:r>
+        <w:t>MONTH(</w:t>
+      </w:r>
+      <w:proofErr w:type="gramEnd"/>
+      <w:r>
+        <w:t>)</w:t>
+      </w:r>
+    </w:p>
+    <w:p>
+      <w:pPr>
+        <w:pStyle w:val="ListParagraph"/>
+        <w:numPr>
+          <w:ilvl w:val="0"/>
+          <w:numId w:val="7"/>
+        </w:numPr>
+      </w:pPr>
+      <w:r>
+        <w:t xml:space="preserve">Math function – </w:t>
+      </w:r>
+      <w:proofErr w:type="gramStart"/>
+      <w:r>
+        <w:t>ROUND(</w:t>
+      </w:r>
+      <w:proofErr w:type="gramEnd"/>
+      <w:r>
+        <w:t xml:space="preserve">), </w:t>
+      </w:r>
+      <w:proofErr w:type="gramStart"/>
+      <w:r>
+        <w:t>FLOOR(</w:t>
+      </w:r>
+      <w:proofErr w:type="gramEnd"/>
+      <w:r>
+        <w:t>)</w:t>
       </w:r>
     </w:p>
     <w:p>
@@ -156,6 +450,7 @@
         </w:numPr>
       </w:pPr>
       <w:r>
+        <w:lastRenderedPageBreak/>
         <w:t>Update the patients table for the allergies column. If the patient's allergies is null then replace it with 'NKA'</w:t>
       </w:r>
       <w:r>
@@ -217,7 +512,6 @@
         </w:numPr>
       </w:pPr>
       <w:r>
-        <w:lastRenderedPageBreak/>
         <w:t>Show first name, last name, and the </w:t>
       </w:r>
       <w:r>
@@ -344,6 +638,7 @@
         </w:numPr>
       </w:pPr>
       <w:r>
+        <w:lastRenderedPageBreak/>
         <w:t>Show all columns for patients who have one of the following patient_ids:</w:t>
       </w:r>
       <w:r>
@@ -555,6 +850,7 @@
         </w:numPr>
       </w:pPr>
       <w:r>
+        <w:lastRenderedPageBreak/>
         <w:t>Show unique birth years from patients and order them by ascending.</w:t>
       </w:r>
     </w:p>
@@ -614,7 +910,6 @@
         <w:pStyle w:val="ListParagraph"/>
       </w:pPr>
       <w:r>
-        <w:lastRenderedPageBreak/>
         <w:br/>
       </w:r>
       <w:r>
@@ -752,6 +1047,7 @@
         <w:pStyle w:val="ListParagraph"/>
       </w:pPr>
       <w:r>
+        <w:lastRenderedPageBreak/>
         <w:br/>
       </w:r>
       <w:r>
@@ -808,7 +1104,6 @@
         <w:pStyle w:val="ListParagraph"/>
       </w:pPr>
       <w:r>
-        <w:lastRenderedPageBreak/>
         <w:br/>
         <w:t>select sum(case when gender = 'M' then 1 end) as male_count, sum(case when gender = 'F' then 1 end) as female_count from patients;</w:t>
       </w:r>
@@ -940,6 +1235,7 @@
         <w:pStyle w:val="ListParagraph"/>
       </w:pPr>
       <w:r>
+        <w:lastRenderedPageBreak/>
         <w:br/>
       </w:r>
       <w:r>
@@ -1023,7 +1319,6 @@
         <w:pStyle w:val="ListParagraph"/>
       </w:pPr>
       <w:r>
-        <w:lastRenderedPageBreak/>
         <w:t>select allergies, count(allergies) as total_diagnosis from patients where allergies is not null group by allergies order by count(allergies) desc;</w:t>
       </w:r>
     </w:p>
@@ -1117,6 +1412,7 @@
         <w:ind w:left="720"/>
       </w:pPr>
       <w:r>
+        <w:lastRenderedPageBreak/>
         <w:t>select * from (select province_id, SUM(height) as sum_height FROM patients group by province_id) where sum_height &gt;= 7000;</w:t>
       </w:r>
     </w:p>
@@ -1157,7 +1453,6 @@
         <w:ind w:left="720"/>
       </w:pPr>
       <w:r>
-        <w:lastRenderedPageBreak/>
         <w:t>select day(admission_date) as day_number, count(patient_id) as number_of_admissions from admissions group by day_number order by number_of_admissions desc;</w:t>
       </w:r>
     </w:p>
@@ -1295,6 +1590,7 @@
         </w:numPr>
       </w:pPr>
       <w:r>
+        <w:lastRenderedPageBreak/>
         <w:t>Show first_name, last_name, and the total number of admissions attended for each doctor.</w:t>
       </w:r>
       <w:r>
@@ -1330,10 +1626,9 @@
     </w:p>
     <w:p>
       <w:pPr>
-        <w:ind w:left="360"/>
-      </w:pPr>
-      <w:r>
-        <w:lastRenderedPageBreak/>
+        <w:ind w:left="720"/>
+      </w:pPr>
+      <w:r>
         <w:t>select d.doctor_id, d.first_name || ' ' || d.last_name, min(a.admission_date) as first_admission_date, max(a.admission_date) as last_admission_date from doctors as d join admissions as a on d.doctor_id=a.attending_doctor_id group by d.doctor_id;</w:t>
       </w:r>
     </w:p>
@@ -1459,6 +1754,9 @@
       </w:r>
       <w:r>
         <w:br/>
+      </w:r>
+      <w:r>
+        <w:lastRenderedPageBreak/>
         <w:t>case</w:t>
       </w:r>
       <w:r>
@@ -1495,7 +1793,6 @@
         <w:ind w:left="720"/>
       </w:pPr>
       <w:r>
-        <w:lastRenderedPageBreak/>
         <w:t>select patient_id, first_name, last_name from patients where patient_id not in (select patient_id from admissions);</w:t>
       </w:r>
     </w:p>
@@ -1880,6 +2177,7 @@
         <w:rPr>
           <w:color w:val="EE0000"/>
         </w:rPr>
+        <w:lastRenderedPageBreak/>
         <w:t xml:space="preserve">Show </w:t>
       </w:r>
       <w:proofErr w:type="spellStart"/>
@@ -2008,9 +2306,6 @@
       </w:r>
       <w:r>
         <w:br/>
-      </w:r>
-      <w:r>
-        <w:lastRenderedPageBreak/>
         <w:t xml:space="preserve">    </w:t>
       </w:r>
       <w:r>
@@ -2465,6 +2760,7 @@
         <w:ind w:left="720"/>
       </w:pPr>
       <w:r>
+        <w:lastRenderedPageBreak/>
         <w:t>select distinct</w:t>
       </w:r>
       <w:r>
@@ -2621,11 +2917,6 @@
       <w:pPr>
         <w:ind w:left="720"/>
       </w:pPr>
-    </w:p>
-    <w:p>
-      <w:pPr>
-        <w:ind w:left="720"/>
-      </w:pPr>
       <w:r>
         <w:t xml:space="preserve">select </w:t>
       </w:r>
@@ -2686,7 +2977,9 @@
         <w:t>from</w:t>
       </w:r>
       <w:r>
-        <w:br/>
+        <w:t xml:space="preserve"> </w:t>
+      </w:r>
+      <w:r>
         <w:t xml:space="preserve">(select </w:t>
       </w:r>
       <w:r>
@@ -2750,7 +3043,9 @@
         <w:t>from admissions</w:t>
       </w:r>
       <w:r>
-        <w:br/>
+        <w:t xml:space="preserve"> </w:t>
+      </w:r>
+      <w:r>
         <w:t xml:space="preserve">group by </w:t>
       </w:r>
       <w:proofErr w:type="spellStart"/>
@@ -2995,6 +3290,7 @@
         <w:ind w:left="720"/>
       </w:pPr>
       <w:r>
+        <w:lastRenderedPageBreak/>
         <w:t xml:space="preserve">select </w:t>
       </w:r>
       <w:proofErr w:type="gramStart"/>
@@ -3067,7 +3363,6 @@
         <w:ind w:left="720"/>
       </w:pPr>
       <w:r>
-        <w:lastRenderedPageBreak/>
         <w:t xml:space="preserve">SELECT </w:t>
       </w:r>
       <w:proofErr w:type="gramStart"/>
@@ -3597,16 +3892,6 @@
       <w:r>
         <w:t>;</w:t>
       </w:r>
-    </w:p>
-    <w:p>
-      <w:pPr>
-        <w:ind w:left="720"/>
-      </w:pPr>
-    </w:p>
-    <w:p>
-      <w:pPr>
-        <w:ind w:left="720"/>
-      </w:pPr>
     </w:p>
     <w:p>
       <w:pPr>
@@ -3629,6 +3914,304 @@
 <file path=word/numbering.xml><?xml version="1.0" encoding="utf-8"?>
 <w:numbering xmlns:wpc="http://schemas.microsoft.com/office/word/2010/wordprocessingCanvas" xmlns:cx="http://schemas.microsoft.com/office/drawing/2014/chartex" xmlns:cx1="http://schemas.microsoft.com/office/drawing/2015/9/8/chartex" xmlns:cx2="http://schemas.microsoft.com/office/drawing/2015/10/21/chartex" xmlns:cx3="http://schemas.microsoft.com/office/drawing/2016/5/9/chartex" xmlns:cx4="http://schemas.microsoft.com/office/drawing/2016/5/10/chartex" xmlns:cx5="http://schemas.microsoft.com/office/drawing/2016/5/11/chartex" xmlns:cx6="http://schemas.microsoft.com/office/drawing/2016/5/12/chartex" xmlns:cx7="http://schemas.microsoft.com/office/drawing/2016/5/13/chartex" xmlns:cx8="http://schemas.microsoft.com/office/drawing/2016/5/14/chartex" xmlns:mc="http://schemas.openxmlformats.org/markup-compatibility/2006" xmlns:aink="http://schemas.microsoft.com/office/drawing/2016/ink" xmlns:am3d="http://schemas.microsoft.com/office/drawing/2017/model3d" xmlns:o="urn:schemas-microsoft-com:office:office" xmlns:oel="http://schemas.microsoft.com/office/2019/extlst" xmlns:r="http://schemas.openxmlformats.org/officeDocument/2006/relationships" xmlns:m="http://schemas.openxmlformats.org/officeDocument/2006/math" xmlns:v="urn:schemas-microsoft-com:vml" xmlns:wp14="http://schemas.microsoft.com/office/word/2010/wordprocessingDrawing" xmlns:wp="http://schemas.openxmlformats.org/drawingml/2006/wordprocessingDrawing" xmlns:w10="urn:schemas-microsoft-com:office:word" xmlns:w="http://schemas.openxmlformats.org/wordprocessingml/2006/main" xmlns:w14="http://schemas.microsoft.com/office/word/2010/wordml" xmlns:w15="http://schemas.microsoft.com/office/word/2012/wordml" xmlns:w16cex="http://schemas.microsoft.com/office/word/2018/wordml/cex" xmlns:w16cid="http://schemas.microsoft.com/office/word/2016/wordml/cid" xmlns:w16="http://schemas.microsoft.com/office/word/2018/wordml" xmlns:w16du="http://schemas.microsoft.com/office/word/2023/wordml/word16du" xmlns:w16sdtdh="http://schemas.microsoft.com/office/word/2020/wordml/sdtdatahash" xmlns:w16sdtfl="http://schemas.microsoft.com/office/word/2024/wordml/sdtformatlock" xmlns:w16se="http://schemas.microsoft.com/office/word/2015/wordml/symex" xmlns:wpg="http://schemas.microsoft.com/office/word/2010/wordprocessingGroup" xmlns:wpi="http://schemas.microsoft.com/office/word/2010/wordprocessingInk" xmlns:wne="http://schemas.microsoft.com/office/word/2006/wordml" xmlns:wps="http://schemas.microsoft.com/office/word/2010/wordprocessingShape" mc:Ignorable="w14 w15 w16se w16cid w16 w16cex w16sdtdh w16sdtfl w16du wp14">
   <w:abstractNum w:abstractNumId="0" w15:restartNumberingAfterBreak="0">
+    <w:nsid w:val="071D04D4"/>
+    <w:multiLevelType w:val="multilevel"/>
+    <w:tmpl w:val="F03238BE"/>
+    <w:lvl w:ilvl="0">
+      <w:start w:val="1"/>
+      <w:numFmt w:val="bullet"/>
+      <w:lvlText w:val=""/>
+      <w:lvlJc w:val="left"/>
+      <w:pPr>
+        <w:tabs>
+          <w:tab w:val="num" w:pos="720"/>
+        </w:tabs>
+        <w:ind w:left="720" w:hanging="360"/>
+      </w:pPr>
+      <w:rPr>
+        <w:rFonts w:ascii="Symbol" w:hAnsi="Symbol" w:hint="default"/>
+        <w:sz w:val="20"/>
+      </w:rPr>
+    </w:lvl>
+    <w:lvl w:ilvl="1" w:tentative="1">
+      <w:start w:val="1"/>
+      <w:numFmt w:val="bullet"/>
+      <w:lvlText w:val="o"/>
+      <w:lvlJc w:val="left"/>
+      <w:pPr>
+        <w:tabs>
+          <w:tab w:val="num" w:pos="1440"/>
+        </w:tabs>
+        <w:ind w:left="1440" w:hanging="360"/>
+      </w:pPr>
+      <w:rPr>
+        <w:rFonts w:ascii="Courier New" w:hAnsi="Courier New" w:hint="default"/>
+        <w:sz w:val="20"/>
+      </w:rPr>
+    </w:lvl>
+    <w:lvl w:ilvl="2" w:tentative="1">
+      <w:start w:val="1"/>
+      <w:numFmt w:val="bullet"/>
+      <w:lvlText w:val=""/>
+      <w:lvlJc w:val="left"/>
+      <w:pPr>
+        <w:tabs>
+          <w:tab w:val="num" w:pos="2160"/>
+        </w:tabs>
+        <w:ind w:left="2160" w:hanging="360"/>
+      </w:pPr>
+      <w:rPr>
+        <w:rFonts w:ascii="Wingdings" w:hAnsi="Wingdings" w:hint="default"/>
+        <w:sz w:val="20"/>
+      </w:rPr>
+    </w:lvl>
+    <w:lvl w:ilvl="3" w:tentative="1">
+      <w:start w:val="1"/>
+      <w:numFmt w:val="bullet"/>
+      <w:lvlText w:val=""/>
+      <w:lvlJc w:val="left"/>
+      <w:pPr>
+        <w:tabs>
+          <w:tab w:val="num" w:pos="2880"/>
+        </w:tabs>
+        <w:ind w:left="2880" w:hanging="360"/>
+      </w:pPr>
+      <w:rPr>
+        <w:rFonts w:ascii="Wingdings" w:hAnsi="Wingdings" w:hint="default"/>
+        <w:sz w:val="20"/>
+      </w:rPr>
+    </w:lvl>
+    <w:lvl w:ilvl="4" w:tentative="1">
+      <w:start w:val="1"/>
+      <w:numFmt w:val="bullet"/>
+      <w:lvlText w:val=""/>
+      <w:lvlJc w:val="left"/>
+      <w:pPr>
+        <w:tabs>
+          <w:tab w:val="num" w:pos="3600"/>
+        </w:tabs>
+        <w:ind w:left="3600" w:hanging="360"/>
+      </w:pPr>
+      <w:rPr>
+        <w:rFonts w:ascii="Wingdings" w:hAnsi="Wingdings" w:hint="default"/>
+        <w:sz w:val="20"/>
+      </w:rPr>
+    </w:lvl>
+    <w:lvl w:ilvl="5" w:tentative="1">
+      <w:start w:val="1"/>
+      <w:numFmt w:val="bullet"/>
+      <w:lvlText w:val=""/>
+      <w:lvlJc w:val="left"/>
+      <w:pPr>
+        <w:tabs>
+          <w:tab w:val="num" w:pos="4320"/>
+        </w:tabs>
+        <w:ind w:left="4320" w:hanging="360"/>
+      </w:pPr>
+      <w:rPr>
+        <w:rFonts w:ascii="Wingdings" w:hAnsi="Wingdings" w:hint="default"/>
+        <w:sz w:val="20"/>
+      </w:rPr>
+    </w:lvl>
+    <w:lvl w:ilvl="6" w:tentative="1">
+      <w:start w:val="1"/>
+      <w:numFmt w:val="bullet"/>
+      <w:lvlText w:val=""/>
+      <w:lvlJc w:val="left"/>
+      <w:pPr>
+        <w:tabs>
+          <w:tab w:val="num" w:pos="5040"/>
+        </w:tabs>
+        <w:ind w:left="5040" w:hanging="360"/>
+      </w:pPr>
+      <w:rPr>
+        <w:rFonts w:ascii="Wingdings" w:hAnsi="Wingdings" w:hint="default"/>
+        <w:sz w:val="20"/>
+      </w:rPr>
+    </w:lvl>
+    <w:lvl w:ilvl="7" w:tentative="1">
+      <w:start w:val="1"/>
+      <w:numFmt w:val="bullet"/>
+      <w:lvlText w:val=""/>
+      <w:lvlJc w:val="left"/>
+      <w:pPr>
+        <w:tabs>
+          <w:tab w:val="num" w:pos="5760"/>
+        </w:tabs>
+        <w:ind w:left="5760" w:hanging="360"/>
+      </w:pPr>
+      <w:rPr>
+        <w:rFonts w:ascii="Wingdings" w:hAnsi="Wingdings" w:hint="default"/>
+        <w:sz w:val="20"/>
+      </w:rPr>
+    </w:lvl>
+    <w:lvl w:ilvl="8" w:tentative="1">
+      <w:start w:val="1"/>
+      <w:numFmt w:val="bullet"/>
+      <w:lvlText w:val=""/>
+      <w:lvlJc w:val="left"/>
+      <w:pPr>
+        <w:tabs>
+          <w:tab w:val="num" w:pos="6480"/>
+        </w:tabs>
+        <w:ind w:left="6480" w:hanging="360"/>
+      </w:pPr>
+      <w:rPr>
+        <w:rFonts w:ascii="Wingdings" w:hAnsi="Wingdings" w:hint="default"/>
+        <w:sz w:val="20"/>
+      </w:rPr>
+    </w:lvl>
+  </w:abstractNum>
+  <w:abstractNum w:abstractNumId="1" w15:restartNumberingAfterBreak="0">
+    <w:nsid w:val="31235BB7"/>
+    <w:multiLevelType w:val="multilevel"/>
+    <w:tmpl w:val="965A9A7E"/>
+    <w:lvl w:ilvl="0">
+      <w:start w:val="1"/>
+      <w:numFmt w:val="bullet"/>
+      <w:lvlText w:val=""/>
+      <w:lvlJc w:val="left"/>
+      <w:pPr>
+        <w:tabs>
+          <w:tab w:val="num" w:pos="720"/>
+        </w:tabs>
+        <w:ind w:left="720" w:hanging="360"/>
+      </w:pPr>
+      <w:rPr>
+        <w:rFonts w:ascii="Symbol" w:hAnsi="Symbol" w:hint="default"/>
+        <w:sz w:val="20"/>
+      </w:rPr>
+    </w:lvl>
+    <w:lvl w:ilvl="1" w:tentative="1">
+      <w:start w:val="1"/>
+      <w:numFmt w:val="bullet"/>
+      <w:lvlText w:val="o"/>
+      <w:lvlJc w:val="left"/>
+      <w:pPr>
+        <w:tabs>
+          <w:tab w:val="num" w:pos="1440"/>
+        </w:tabs>
+        <w:ind w:left="1440" w:hanging="360"/>
+      </w:pPr>
+      <w:rPr>
+        <w:rFonts w:ascii="Courier New" w:hAnsi="Courier New" w:hint="default"/>
+        <w:sz w:val="20"/>
+      </w:rPr>
+    </w:lvl>
+    <w:lvl w:ilvl="2" w:tentative="1">
+      <w:start w:val="1"/>
+      <w:numFmt w:val="bullet"/>
+      <w:lvlText w:val=""/>
+      <w:lvlJc w:val="left"/>
+      <w:pPr>
+        <w:tabs>
+          <w:tab w:val="num" w:pos="2160"/>
+        </w:tabs>
+        <w:ind w:left="2160" w:hanging="360"/>
+      </w:pPr>
+      <w:rPr>
+        <w:rFonts w:ascii="Wingdings" w:hAnsi="Wingdings" w:hint="default"/>
+        <w:sz w:val="20"/>
+      </w:rPr>
+    </w:lvl>
+    <w:lvl w:ilvl="3" w:tentative="1">
+      <w:start w:val="1"/>
+      <w:numFmt w:val="bullet"/>
+      <w:lvlText w:val=""/>
+      <w:lvlJc w:val="left"/>
+      <w:pPr>
+        <w:tabs>
+          <w:tab w:val="num" w:pos="2880"/>
+        </w:tabs>
+        <w:ind w:left="2880" w:hanging="360"/>
+      </w:pPr>
+      <w:rPr>
+        <w:rFonts w:ascii="Wingdings" w:hAnsi="Wingdings" w:hint="default"/>
+        <w:sz w:val="20"/>
+      </w:rPr>
+    </w:lvl>
+    <w:lvl w:ilvl="4" w:tentative="1">
+      <w:start w:val="1"/>
+      <w:numFmt w:val="bullet"/>
+      <w:lvlText w:val=""/>
+      <w:lvlJc w:val="left"/>
+      <w:pPr>
+        <w:tabs>
+          <w:tab w:val="num" w:pos="3600"/>
+        </w:tabs>
+        <w:ind w:left="3600" w:hanging="360"/>
+      </w:pPr>
+      <w:rPr>
+        <w:rFonts w:ascii="Wingdings" w:hAnsi="Wingdings" w:hint="default"/>
+        <w:sz w:val="20"/>
+      </w:rPr>
+    </w:lvl>
+    <w:lvl w:ilvl="5" w:tentative="1">
+      <w:start w:val="1"/>
+      <w:numFmt w:val="bullet"/>
+      <w:lvlText w:val=""/>
+      <w:lvlJc w:val="left"/>
+      <w:pPr>
+        <w:tabs>
+          <w:tab w:val="num" w:pos="4320"/>
+        </w:tabs>
+        <w:ind w:left="4320" w:hanging="360"/>
+      </w:pPr>
+      <w:rPr>
+        <w:rFonts w:ascii="Wingdings" w:hAnsi="Wingdings" w:hint="default"/>
+        <w:sz w:val="20"/>
+      </w:rPr>
+    </w:lvl>
+    <w:lvl w:ilvl="6" w:tentative="1">
+      <w:start w:val="1"/>
+      <w:numFmt w:val="bullet"/>
+      <w:lvlText w:val=""/>
+      <w:lvlJc w:val="left"/>
+      <w:pPr>
+        <w:tabs>
+          <w:tab w:val="num" w:pos="5040"/>
+        </w:tabs>
+        <w:ind w:left="5040" w:hanging="360"/>
+      </w:pPr>
+      <w:rPr>
+        <w:rFonts w:ascii="Wingdings" w:hAnsi="Wingdings" w:hint="default"/>
+        <w:sz w:val="20"/>
+      </w:rPr>
+    </w:lvl>
+    <w:lvl w:ilvl="7" w:tentative="1">
+      <w:start w:val="1"/>
+      <w:numFmt w:val="bullet"/>
+      <w:lvlText w:val=""/>
+      <w:lvlJc w:val="left"/>
+      <w:pPr>
+        <w:tabs>
+          <w:tab w:val="num" w:pos="5760"/>
+        </w:tabs>
+        <w:ind w:left="5760" w:hanging="360"/>
+      </w:pPr>
+      <w:rPr>
+        <w:rFonts w:ascii="Wingdings" w:hAnsi="Wingdings" w:hint="default"/>
+        <w:sz w:val="20"/>
+      </w:rPr>
+    </w:lvl>
+    <w:lvl w:ilvl="8" w:tentative="1">
+      <w:start w:val="1"/>
+      <w:numFmt w:val="bullet"/>
+      <w:lvlText w:val=""/>
+      <w:lvlJc w:val="left"/>
+      <w:pPr>
+        <w:tabs>
+          <w:tab w:val="num" w:pos="6480"/>
+        </w:tabs>
+        <w:ind w:left="6480" w:hanging="360"/>
+      </w:pPr>
+      <w:rPr>
+        <w:rFonts w:ascii="Wingdings" w:hAnsi="Wingdings" w:hint="default"/>
+        <w:sz w:val="20"/>
+      </w:rPr>
+    </w:lvl>
+  </w:abstractNum>
+  <w:abstractNum w:abstractNumId="2" w15:restartNumberingAfterBreak="0">
     <w:nsid w:val="34013B04"/>
     <w:multiLevelType w:val="hybridMultilevel"/>
     <w:tmpl w:val="926235C0"/>
@@ -3714,7 +4297,7 @@
       </w:pPr>
     </w:lvl>
   </w:abstractNum>
-  <w:abstractNum w:abstractNumId="1" w15:restartNumberingAfterBreak="0">
+  <w:abstractNum w:abstractNumId="3" w15:restartNumberingAfterBreak="0">
     <w:nsid w:val="41081814"/>
     <w:multiLevelType w:val="hybridMultilevel"/>
     <w:tmpl w:val="33407492"/>
@@ -3803,7 +4386,454 @@
       </w:pPr>
     </w:lvl>
   </w:abstractNum>
-  <w:abstractNum w:abstractNumId="2" w15:restartNumberingAfterBreak="0">
+  <w:abstractNum w:abstractNumId="4" w15:restartNumberingAfterBreak="0">
+    <w:nsid w:val="45272104"/>
+    <w:multiLevelType w:val="multilevel"/>
+    <w:tmpl w:val="B9FEEDF2"/>
+    <w:lvl w:ilvl="0">
+      <w:start w:val="1"/>
+      <w:numFmt w:val="bullet"/>
+      <w:lvlText w:val=""/>
+      <w:lvlJc w:val="left"/>
+      <w:pPr>
+        <w:tabs>
+          <w:tab w:val="num" w:pos="720"/>
+        </w:tabs>
+        <w:ind w:left="720" w:hanging="360"/>
+      </w:pPr>
+      <w:rPr>
+        <w:rFonts w:ascii="Symbol" w:hAnsi="Symbol" w:hint="default"/>
+        <w:sz w:val="20"/>
+      </w:rPr>
+    </w:lvl>
+    <w:lvl w:ilvl="1" w:tentative="1">
+      <w:start w:val="1"/>
+      <w:numFmt w:val="bullet"/>
+      <w:lvlText w:val="o"/>
+      <w:lvlJc w:val="left"/>
+      <w:pPr>
+        <w:tabs>
+          <w:tab w:val="num" w:pos="1440"/>
+        </w:tabs>
+        <w:ind w:left="1440" w:hanging="360"/>
+      </w:pPr>
+      <w:rPr>
+        <w:rFonts w:ascii="Courier New" w:hAnsi="Courier New" w:hint="default"/>
+        <w:sz w:val="20"/>
+      </w:rPr>
+    </w:lvl>
+    <w:lvl w:ilvl="2" w:tentative="1">
+      <w:start w:val="1"/>
+      <w:numFmt w:val="bullet"/>
+      <w:lvlText w:val=""/>
+      <w:lvlJc w:val="left"/>
+      <w:pPr>
+        <w:tabs>
+          <w:tab w:val="num" w:pos="2160"/>
+        </w:tabs>
+        <w:ind w:left="2160" w:hanging="360"/>
+      </w:pPr>
+      <w:rPr>
+        <w:rFonts w:ascii="Wingdings" w:hAnsi="Wingdings" w:hint="default"/>
+        <w:sz w:val="20"/>
+      </w:rPr>
+    </w:lvl>
+    <w:lvl w:ilvl="3" w:tentative="1">
+      <w:start w:val="1"/>
+      <w:numFmt w:val="bullet"/>
+      <w:lvlText w:val=""/>
+      <w:lvlJc w:val="left"/>
+      <w:pPr>
+        <w:tabs>
+          <w:tab w:val="num" w:pos="2880"/>
+        </w:tabs>
+        <w:ind w:left="2880" w:hanging="360"/>
+      </w:pPr>
+      <w:rPr>
+        <w:rFonts w:ascii="Wingdings" w:hAnsi="Wingdings" w:hint="default"/>
+        <w:sz w:val="20"/>
+      </w:rPr>
+    </w:lvl>
+    <w:lvl w:ilvl="4" w:tentative="1">
+      <w:start w:val="1"/>
+      <w:numFmt w:val="bullet"/>
+      <w:lvlText w:val=""/>
+      <w:lvlJc w:val="left"/>
+      <w:pPr>
+        <w:tabs>
+          <w:tab w:val="num" w:pos="3600"/>
+        </w:tabs>
+        <w:ind w:left="3600" w:hanging="360"/>
+      </w:pPr>
+      <w:rPr>
+        <w:rFonts w:ascii="Wingdings" w:hAnsi="Wingdings" w:hint="default"/>
+        <w:sz w:val="20"/>
+      </w:rPr>
+    </w:lvl>
+    <w:lvl w:ilvl="5" w:tentative="1">
+      <w:start w:val="1"/>
+      <w:numFmt w:val="bullet"/>
+      <w:lvlText w:val=""/>
+      <w:lvlJc w:val="left"/>
+      <w:pPr>
+        <w:tabs>
+          <w:tab w:val="num" w:pos="4320"/>
+        </w:tabs>
+        <w:ind w:left="4320" w:hanging="360"/>
+      </w:pPr>
+      <w:rPr>
+        <w:rFonts w:ascii="Wingdings" w:hAnsi="Wingdings" w:hint="default"/>
+        <w:sz w:val="20"/>
+      </w:rPr>
+    </w:lvl>
+    <w:lvl w:ilvl="6" w:tentative="1">
+      <w:start w:val="1"/>
+      <w:numFmt w:val="bullet"/>
+      <w:lvlText w:val=""/>
+      <w:lvlJc w:val="left"/>
+      <w:pPr>
+        <w:tabs>
+          <w:tab w:val="num" w:pos="5040"/>
+        </w:tabs>
+        <w:ind w:left="5040" w:hanging="360"/>
+      </w:pPr>
+      <w:rPr>
+        <w:rFonts w:ascii="Wingdings" w:hAnsi="Wingdings" w:hint="default"/>
+        <w:sz w:val="20"/>
+      </w:rPr>
+    </w:lvl>
+    <w:lvl w:ilvl="7" w:tentative="1">
+      <w:start w:val="1"/>
+      <w:numFmt w:val="bullet"/>
+      <w:lvlText w:val=""/>
+      <w:lvlJc w:val="left"/>
+      <w:pPr>
+        <w:tabs>
+          <w:tab w:val="num" w:pos="5760"/>
+        </w:tabs>
+        <w:ind w:left="5760" w:hanging="360"/>
+      </w:pPr>
+      <w:rPr>
+        <w:rFonts w:ascii="Wingdings" w:hAnsi="Wingdings" w:hint="default"/>
+        <w:sz w:val="20"/>
+      </w:rPr>
+    </w:lvl>
+    <w:lvl w:ilvl="8" w:tentative="1">
+      <w:start w:val="1"/>
+      <w:numFmt w:val="bullet"/>
+      <w:lvlText w:val=""/>
+      <w:lvlJc w:val="left"/>
+      <w:pPr>
+        <w:tabs>
+          <w:tab w:val="num" w:pos="6480"/>
+        </w:tabs>
+        <w:ind w:left="6480" w:hanging="360"/>
+      </w:pPr>
+      <w:rPr>
+        <w:rFonts w:ascii="Wingdings" w:hAnsi="Wingdings" w:hint="default"/>
+        <w:sz w:val="20"/>
+      </w:rPr>
+    </w:lvl>
+  </w:abstractNum>
+  <w:abstractNum w:abstractNumId="5" w15:restartNumberingAfterBreak="0">
+    <w:nsid w:val="4B7E569F"/>
+    <w:multiLevelType w:val="multilevel"/>
+    <w:tmpl w:val="8D9C2EF0"/>
+    <w:lvl w:ilvl="0">
+      <w:start w:val="1"/>
+      <w:numFmt w:val="bullet"/>
+      <w:lvlText w:val=""/>
+      <w:lvlJc w:val="left"/>
+      <w:pPr>
+        <w:tabs>
+          <w:tab w:val="num" w:pos="720"/>
+        </w:tabs>
+        <w:ind w:left="720" w:hanging="360"/>
+      </w:pPr>
+      <w:rPr>
+        <w:rFonts w:ascii="Symbol" w:hAnsi="Symbol" w:hint="default"/>
+        <w:sz w:val="20"/>
+      </w:rPr>
+    </w:lvl>
+    <w:lvl w:ilvl="1" w:tentative="1">
+      <w:start w:val="1"/>
+      <w:numFmt w:val="bullet"/>
+      <w:lvlText w:val="o"/>
+      <w:lvlJc w:val="left"/>
+      <w:pPr>
+        <w:tabs>
+          <w:tab w:val="num" w:pos="1440"/>
+        </w:tabs>
+        <w:ind w:left="1440" w:hanging="360"/>
+      </w:pPr>
+      <w:rPr>
+        <w:rFonts w:ascii="Courier New" w:hAnsi="Courier New" w:hint="default"/>
+        <w:sz w:val="20"/>
+      </w:rPr>
+    </w:lvl>
+    <w:lvl w:ilvl="2" w:tentative="1">
+      <w:start w:val="1"/>
+      <w:numFmt w:val="bullet"/>
+      <w:lvlText w:val=""/>
+      <w:lvlJc w:val="left"/>
+      <w:pPr>
+        <w:tabs>
+          <w:tab w:val="num" w:pos="2160"/>
+        </w:tabs>
+        <w:ind w:left="2160" w:hanging="360"/>
+      </w:pPr>
+      <w:rPr>
+        <w:rFonts w:ascii="Wingdings" w:hAnsi="Wingdings" w:hint="default"/>
+        <w:sz w:val="20"/>
+      </w:rPr>
+    </w:lvl>
+    <w:lvl w:ilvl="3" w:tentative="1">
+      <w:start w:val="1"/>
+      <w:numFmt w:val="bullet"/>
+      <w:lvlText w:val=""/>
+      <w:lvlJc w:val="left"/>
+      <w:pPr>
+        <w:tabs>
+          <w:tab w:val="num" w:pos="2880"/>
+        </w:tabs>
+        <w:ind w:left="2880" w:hanging="360"/>
+      </w:pPr>
+      <w:rPr>
+        <w:rFonts w:ascii="Wingdings" w:hAnsi="Wingdings" w:hint="default"/>
+        <w:sz w:val="20"/>
+      </w:rPr>
+    </w:lvl>
+    <w:lvl w:ilvl="4" w:tentative="1">
+      <w:start w:val="1"/>
+      <w:numFmt w:val="bullet"/>
+      <w:lvlText w:val=""/>
+      <w:lvlJc w:val="left"/>
+      <w:pPr>
+        <w:tabs>
+          <w:tab w:val="num" w:pos="3600"/>
+        </w:tabs>
+        <w:ind w:left="3600" w:hanging="360"/>
+      </w:pPr>
+      <w:rPr>
+        <w:rFonts w:ascii="Wingdings" w:hAnsi="Wingdings" w:hint="default"/>
+        <w:sz w:val="20"/>
+      </w:rPr>
+    </w:lvl>
+    <w:lvl w:ilvl="5" w:tentative="1">
+      <w:start w:val="1"/>
+      <w:numFmt w:val="bullet"/>
+      <w:lvlText w:val=""/>
+      <w:lvlJc w:val="left"/>
+      <w:pPr>
+        <w:tabs>
+          <w:tab w:val="num" w:pos="4320"/>
+        </w:tabs>
+        <w:ind w:left="4320" w:hanging="360"/>
+      </w:pPr>
+      <w:rPr>
+        <w:rFonts w:ascii="Wingdings" w:hAnsi="Wingdings" w:hint="default"/>
+        <w:sz w:val="20"/>
+      </w:rPr>
+    </w:lvl>
+    <w:lvl w:ilvl="6" w:tentative="1">
+      <w:start w:val="1"/>
+      <w:numFmt w:val="bullet"/>
+      <w:lvlText w:val=""/>
+      <w:lvlJc w:val="left"/>
+      <w:pPr>
+        <w:tabs>
+          <w:tab w:val="num" w:pos="5040"/>
+        </w:tabs>
+        <w:ind w:left="5040" w:hanging="360"/>
+      </w:pPr>
+      <w:rPr>
+        <w:rFonts w:ascii="Wingdings" w:hAnsi="Wingdings" w:hint="default"/>
+        <w:sz w:val="20"/>
+      </w:rPr>
+    </w:lvl>
+    <w:lvl w:ilvl="7" w:tentative="1">
+      <w:start w:val="1"/>
+      <w:numFmt w:val="bullet"/>
+      <w:lvlText w:val=""/>
+      <w:lvlJc w:val="left"/>
+      <w:pPr>
+        <w:tabs>
+          <w:tab w:val="num" w:pos="5760"/>
+        </w:tabs>
+        <w:ind w:left="5760" w:hanging="360"/>
+      </w:pPr>
+      <w:rPr>
+        <w:rFonts w:ascii="Wingdings" w:hAnsi="Wingdings" w:hint="default"/>
+        <w:sz w:val="20"/>
+      </w:rPr>
+    </w:lvl>
+    <w:lvl w:ilvl="8" w:tentative="1">
+      <w:start w:val="1"/>
+      <w:numFmt w:val="bullet"/>
+      <w:lvlText w:val=""/>
+      <w:lvlJc w:val="left"/>
+      <w:pPr>
+        <w:tabs>
+          <w:tab w:val="num" w:pos="6480"/>
+        </w:tabs>
+        <w:ind w:left="6480" w:hanging="360"/>
+      </w:pPr>
+      <w:rPr>
+        <w:rFonts w:ascii="Wingdings" w:hAnsi="Wingdings" w:hint="default"/>
+        <w:sz w:val="20"/>
+      </w:rPr>
+    </w:lvl>
+  </w:abstractNum>
+  <w:abstractNum w:abstractNumId="6" w15:restartNumberingAfterBreak="0">
+    <w:nsid w:val="552243A8"/>
+    <w:multiLevelType w:val="multilevel"/>
+    <w:tmpl w:val="84AE7008"/>
+    <w:lvl w:ilvl="0">
+      <w:start w:val="1"/>
+      <w:numFmt w:val="bullet"/>
+      <w:lvlText w:val=""/>
+      <w:lvlJc w:val="left"/>
+      <w:pPr>
+        <w:tabs>
+          <w:tab w:val="num" w:pos="720"/>
+        </w:tabs>
+        <w:ind w:left="720" w:hanging="360"/>
+      </w:pPr>
+      <w:rPr>
+        <w:rFonts w:ascii="Symbol" w:hAnsi="Symbol" w:hint="default"/>
+        <w:sz w:val="20"/>
+      </w:rPr>
+    </w:lvl>
+    <w:lvl w:ilvl="1" w:tentative="1">
+      <w:start w:val="1"/>
+      <w:numFmt w:val="bullet"/>
+      <w:lvlText w:val="o"/>
+      <w:lvlJc w:val="left"/>
+      <w:pPr>
+        <w:tabs>
+          <w:tab w:val="num" w:pos="1440"/>
+        </w:tabs>
+        <w:ind w:left="1440" w:hanging="360"/>
+      </w:pPr>
+      <w:rPr>
+        <w:rFonts w:ascii="Courier New" w:hAnsi="Courier New" w:hint="default"/>
+        <w:sz w:val="20"/>
+      </w:rPr>
+    </w:lvl>
+    <w:lvl w:ilvl="2" w:tentative="1">
+      <w:start w:val="1"/>
+      <w:numFmt w:val="bullet"/>
+      <w:lvlText w:val=""/>
+      <w:lvlJc w:val="left"/>
+      <w:pPr>
+        <w:tabs>
+          <w:tab w:val="num" w:pos="2160"/>
+        </w:tabs>
+        <w:ind w:left="2160" w:hanging="360"/>
+      </w:pPr>
+      <w:rPr>
+        <w:rFonts w:ascii="Wingdings" w:hAnsi="Wingdings" w:hint="default"/>
+        <w:sz w:val="20"/>
+      </w:rPr>
+    </w:lvl>
+    <w:lvl w:ilvl="3" w:tentative="1">
+      <w:start w:val="1"/>
+      <w:numFmt w:val="bullet"/>
+      <w:lvlText w:val=""/>
+      <w:lvlJc w:val="left"/>
+      <w:pPr>
+        <w:tabs>
+          <w:tab w:val="num" w:pos="2880"/>
+        </w:tabs>
+        <w:ind w:left="2880" w:hanging="360"/>
+      </w:pPr>
+      <w:rPr>
+        <w:rFonts w:ascii="Wingdings" w:hAnsi="Wingdings" w:hint="default"/>
+        <w:sz w:val="20"/>
+      </w:rPr>
+    </w:lvl>
+    <w:lvl w:ilvl="4" w:tentative="1">
+      <w:start w:val="1"/>
+      <w:numFmt w:val="bullet"/>
+      <w:lvlText w:val=""/>
+      <w:lvlJc w:val="left"/>
+      <w:pPr>
+        <w:tabs>
+          <w:tab w:val="num" w:pos="3600"/>
+        </w:tabs>
+        <w:ind w:left="3600" w:hanging="360"/>
+      </w:pPr>
+      <w:rPr>
+        <w:rFonts w:ascii="Wingdings" w:hAnsi="Wingdings" w:hint="default"/>
+        <w:sz w:val="20"/>
+      </w:rPr>
+    </w:lvl>
+    <w:lvl w:ilvl="5" w:tentative="1">
+      <w:start w:val="1"/>
+      <w:numFmt w:val="bullet"/>
+      <w:lvlText w:val=""/>
+      <w:lvlJc w:val="left"/>
+      <w:pPr>
+        <w:tabs>
+          <w:tab w:val="num" w:pos="4320"/>
+        </w:tabs>
+        <w:ind w:left="4320" w:hanging="360"/>
+      </w:pPr>
+      <w:rPr>
+        <w:rFonts w:ascii="Wingdings" w:hAnsi="Wingdings" w:hint="default"/>
+        <w:sz w:val="20"/>
+      </w:rPr>
+    </w:lvl>
+    <w:lvl w:ilvl="6" w:tentative="1">
+      <w:start w:val="1"/>
+      <w:numFmt w:val="bullet"/>
+      <w:lvlText w:val=""/>
+      <w:lvlJc w:val="left"/>
+      <w:pPr>
+        <w:tabs>
+          <w:tab w:val="num" w:pos="5040"/>
+        </w:tabs>
+        <w:ind w:left="5040" w:hanging="360"/>
+      </w:pPr>
+      <w:rPr>
+        <w:rFonts w:ascii="Wingdings" w:hAnsi="Wingdings" w:hint="default"/>
+        <w:sz w:val="20"/>
+      </w:rPr>
+    </w:lvl>
+    <w:lvl w:ilvl="7" w:tentative="1">
+      <w:start w:val="1"/>
+      <w:numFmt w:val="bullet"/>
+      <w:lvlText w:val=""/>
+      <w:lvlJc w:val="left"/>
+      <w:pPr>
+        <w:tabs>
+          <w:tab w:val="num" w:pos="5760"/>
+        </w:tabs>
+        <w:ind w:left="5760" w:hanging="360"/>
+      </w:pPr>
+      <w:rPr>
+        <w:rFonts w:ascii="Wingdings" w:hAnsi="Wingdings" w:hint="default"/>
+        <w:sz w:val="20"/>
+      </w:rPr>
+    </w:lvl>
+    <w:lvl w:ilvl="8" w:tentative="1">
+      <w:start w:val="1"/>
+      <w:numFmt w:val="bullet"/>
+      <w:lvlText w:val=""/>
+      <w:lvlJc w:val="left"/>
+      <w:pPr>
+        <w:tabs>
+          <w:tab w:val="num" w:pos="6480"/>
+        </w:tabs>
+        <w:ind w:left="6480" w:hanging="360"/>
+      </w:pPr>
+      <w:rPr>
+        <w:rFonts w:ascii="Wingdings" w:hAnsi="Wingdings" w:hint="default"/>
+        <w:sz w:val="20"/>
+      </w:rPr>
+    </w:lvl>
+  </w:abstractNum>
+  <w:abstractNum w:abstractNumId="7" w15:restartNumberingAfterBreak="0">
     <w:nsid w:val="5B406BD1"/>
     <w:multiLevelType w:val="hybridMultilevel"/>
     <w:tmpl w:val="8FAA05AC"/>
@@ -3892,7 +4922,7 @@
       </w:pPr>
     </w:lvl>
   </w:abstractNum>
-  <w:abstractNum w:abstractNumId="3" w15:restartNumberingAfterBreak="0">
+  <w:abstractNum w:abstractNumId="8" w15:restartNumberingAfterBreak="0">
     <w:nsid w:val="651E6A44"/>
     <w:multiLevelType w:val="hybridMultilevel"/>
     <w:tmpl w:val="0F929180"/>
@@ -3981,7 +5011,156 @@
       </w:pPr>
     </w:lvl>
   </w:abstractNum>
-  <w:abstractNum w:abstractNumId="4" w15:restartNumberingAfterBreak="0">
+  <w:abstractNum w:abstractNumId="9" w15:restartNumberingAfterBreak="0">
+    <w:nsid w:val="654C5745"/>
+    <w:multiLevelType w:val="multilevel"/>
+    <w:tmpl w:val="85267B48"/>
+    <w:lvl w:ilvl="0">
+      <w:start w:val="1"/>
+      <w:numFmt w:val="bullet"/>
+      <w:lvlText w:val=""/>
+      <w:lvlJc w:val="left"/>
+      <w:pPr>
+        <w:tabs>
+          <w:tab w:val="num" w:pos="720"/>
+        </w:tabs>
+        <w:ind w:left="720" w:hanging="360"/>
+      </w:pPr>
+      <w:rPr>
+        <w:rFonts w:ascii="Symbol" w:hAnsi="Symbol" w:hint="default"/>
+        <w:sz w:val="20"/>
+      </w:rPr>
+    </w:lvl>
+    <w:lvl w:ilvl="1" w:tentative="1">
+      <w:start w:val="1"/>
+      <w:numFmt w:val="bullet"/>
+      <w:lvlText w:val="o"/>
+      <w:lvlJc w:val="left"/>
+      <w:pPr>
+        <w:tabs>
+          <w:tab w:val="num" w:pos="1440"/>
+        </w:tabs>
+        <w:ind w:left="1440" w:hanging="360"/>
+      </w:pPr>
+      <w:rPr>
+        <w:rFonts w:ascii="Courier New" w:hAnsi="Courier New" w:hint="default"/>
+        <w:sz w:val="20"/>
+      </w:rPr>
+    </w:lvl>
+    <w:lvl w:ilvl="2" w:tentative="1">
+      <w:start w:val="1"/>
+      <w:numFmt w:val="bullet"/>
+      <w:lvlText w:val=""/>
+      <w:lvlJc w:val="left"/>
+      <w:pPr>
+        <w:tabs>
+          <w:tab w:val="num" w:pos="2160"/>
+        </w:tabs>
+        <w:ind w:left="2160" w:hanging="360"/>
+      </w:pPr>
+      <w:rPr>
+        <w:rFonts w:ascii="Wingdings" w:hAnsi="Wingdings" w:hint="default"/>
+        <w:sz w:val="20"/>
+      </w:rPr>
+    </w:lvl>
+    <w:lvl w:ilvl="3" w:tentative="1">
+      <w:start w:val="1"/>
+      <w:numFmt w:val="bullet"/>
+      <w:lvlText w:val=""/>
+      <w:lvlJc w:val="left"/>
+      <w:pPr>
+        <w:tabs>
+          <w:tab w:val="num" w:pos="2880"/>
+        </w:tabs>
+        <w:ind w:left="2880" w:hanging="360"/>
+      </w:pPr>
+      <w:rPr>
+        <w:rFonts w:ascii="Wingdings" w:hAnsi="Wingdings" w:hint="default"/>
+        <w:sz w:val="20"/>
+      </w:rPr>
+    </w:lvl>
+    <w:lvl w:ilvl="4" w:tentative="1">
+      <w:start w:val="1"/>
+      <w:numFmt w:val="bullet"/>
+      <w:lvlText w:val=""/>
+      <w:lvlJc w:val="left"/>
+      <w:pPr>
+        <w:tabs>
+          <w:tab w:val="num" w:pos="3600"/>
+        </w:tabs>
+        <w:ind w:left="3600" w:hanging="360"/>
+      </w:pPr>
+      <w:rPr>
+        <w:rFonts w:ascii="Wingdings" w:hAnsi="Wingdings" w:hint="default"/>
+        <w:sz w:val="20"/>
+      </w:rPr>
+    </w:lvl>
+    <w:lvl w:ilvl="5" w:tentative="1">
+      <w:start w:val="1"/>
+      <w:numFmt w:val="bullet"/>
+      <w:lvlText w:val=""/>
+      <w:lvlJc w:val="left"/>
+      <w:pPr>
+        <w:tabs>
+          <w:tab w:val="num" w:pos="4320"/>
+        </w:tabs>
+        <w:ind w:left="4320" w:hanging="360"/>
+      </w:pPr>
+      <w:rPr>
+        <w:rFonts w:ascii="Wingdings" w:hAnsi="Wingdings" w:hint="default"/>
+        <w:sz w:val="20"/>
+      </w:rPr>
+    </w:lvl>
+    <w:lvl w:ilvl="6" w:tentative="1">
+      <w:start w:val="1"/>
+      <w:numFmt w:val="bullet"/>
+      <w:lvlText w:val=""/>
+      <w:lvlJc w:val="left"/>
+      <w:pPr>
+        <w:tabs>
+          <w:tab w:val="num" w:pos="5040"/>
+        </w:tabs>
+        <w:ind w:left="5040" w:hanging="360"/>
+      </w:pPr>
+      <w:rPr>
+        <w:rFonts w:ascii="Wingdings" w:hAnsi="Wingdings" w:hint="default"/>
+        <w:sz w:val="20"/>
+      </w:rPr>
+    </w:lvl>
+    <w:lvl w:ilvl="7" w:tentative="1">
+      <w:start w:val="1"/>
+      <w:numFmt w:val="bullet"/>
+      <w:lvlText w:val=""/>
+      <w:lvlJc w:val="left"/>
+      <w:pPr>
+        <w:tabs>
+          <w:tab w:val="num" w:pos="5760"/>
+        </w:tabs>
+        <w:ind w:left="5760" w:hanging="360"/>
+      </w:pPr>
+      <w:rPr>
+        <w:rFonts w:ascii="Wingdings" w:hAnsi="Wingdings" w:hint="default"/>
+        <w:sz w:val="20"/>
+      </w:rPr>
+    </w:lvl>
+    <w:lvl w:ilvl="8" w:tentative="1">
+      <w:start w:val="1"/>
+      <w:numFmt w:val="bullet"/>
+      <w:lvlText w:val=""/>
+      <w:lvlJc w:val="left"/>
+      <w:pPr>
+        <w:tabs>
+          <w:tab w:val="num" w:pos="6480"/>
+        </w:tabs>
+        <w:ind w:left="6480" w:hanging="360"/>
+      </w:pPr>
+      <w:rPr>
+        <w:rFonts w:ascii="Wingdings" w:hAnsi="Wingdings" w:hint="default"/>
+        <w:sz w:val="20"/>
+      </w:rPr>
+    </w:lvl>
+  </w:abstractNum>
+  <w:abstractNum w:abstractNumId="10" w15:restartNumberingAfterBreak="0">
     <w:nsid w:val="65F24EE8"/>
     <w:multiLevelType w:val="hybridMultilevel"/>
     <w:tmpl w:val="DA7417C4"/>
@@ -4067,7 +5246,7 @@
       </w:pPr>
     </w:lvl>
   </w:abstractNum>
-  <w:abstractNum w:abstractNumId="5" w15:restartNumberingAfterBreak="0">
+  <w:abstractNum w:abstractNumId="11" w15:restartNumberingAfterBreak="0">
     <w:nsid w:val="724F1E94"/>
     <w:multiLevelType w:val="hybridMultilevel"/>
     <w:tmpl w:val="954610A4"/>
@@ -4153,23 +5332,649 @@
       </w:pPr>
     </w:lvl>
   </w:abstractNum>
+  <w:abstractNum w:abstractNumId="12" w15:restartNumberingAfterBreak="0">
+    <w:nsid w:val="72ED423B"/>
+    <w:multiLevelType w:val="multilevel"/>
+    <w:tmpl w:val="32681CBA"/>
+    <w:lvl w:ilvl="0">
+      <w:start w:val="1"/>
+      <w:numFmt w:val="bullet"/>
+      <w:lvlText w:val=""/>
+      <w:lvlJc w:val="left"/>
+      <w:pPr>
+        <w:tabs>
+          <w:tab w:val="num" w:pos="720"/>
+        </w:tabs>
+        <w:ind w:left="720" w:hanging="360"/>
+      </w:pPr>
+      <w:rPr>
+        <w:rFonts w:ascii="Symbol" w:hAnsi="Symbol" w:hint="default"/>
+        <w:sz w:val="20"/>
+      </w:rPr>
+    </w:lvl>
+    <w:lvl w:ilvl="1" w:tentative="1">
+      <w:start w:val="1"/>
+      <w:numFmt w:val="bullet"/>
+      <w:lvlText w:val="o"/>
+      <w:lvlJc w:val="left"/>
+      <w:pPr>
+        <w:tabs>
+          <w:tab w:val="num" w:pos="1440"/>
+        </w:tabs>
+        <w:ind w:left="1440" w:hanging="360"/>
+      </w:pPr>
+      <w:rPr>
+        <w:rFonts w:ascii="Courier New" w:hAnsi="Courier New" w:hint="default"/>
+        <w:sz w:val="20"/>
+      </w:rPr>
+    </w:lvl>
+    <w:lvl w:ilvl="2" w:tentative="1">
+      <w:start w:val="1"/>
+      <w:numFmt w:val="bullet"/>
+      <w:lvlText w:val=""/>
+      <w:lvlJc w:val="left"/>
+      <w:pPr>
+        <w:tabs>
+          <w:tab w:val="num" w:pos="2160"/>
+        </w:tabs>
+        <w:ind w:left="2160" w:hanging="360"/>
+      </w:pPr>
+      <w:rPr>
+        <w:rFonts w:ascii="Wingdings" w:hAnsi="Wingdings" w:hint="default"/>
+        <w:sz w:val="20"/>
+      </w:rPr>
+    </w:lvl>
+    <w:lvl w:ilvl="3" w:tentative="1">
+      <w:start w:val="1"/>
+      <w:numFmt w:val="bullet"/>
+      <w:lvlText w:val=""/>
+      <w:lvlJc w:val="left"/>
+      <w:pPr>
+        <w:tabs>
+          <w:tab w:val="num" w:pos="2880"/>
+        </w:tabs>
+        <w:ind w:left="2880" w:hanging="360"/>
+      </w:pPr>
+      <w:rPr>
+        <w:rFonts w:ascii="Wingdings" w:hAnsi="Wingdings" w:hint="default"/>
+        <w:sz w:val="20"/>
+      </w:rPr>
+    </w:lvl>
+    <w:lvl w:ilvl="4" w:tentative="1">
+      <w:start w:val="1"/>
+      <w:numFmt w:val="bullet"/>
+      <w:lvlText w:val=""/>
+      <w:lvlJc w:val="left"/>
+      <w:pPr>
+        <w:tabs>
+          <w:tab w:val="num" w:pos="3600"/>
+        </w:tabs>
+        <w:ind w:left="3600" w:hanging="360"/>
+      </w:pPr>
+      <w:rPr>
+        <w:rFonts w:ascii="Wingdings" w:hAnsi="Wingdings" w:hint="default"/>
+        <w:sz w:val="20"/>
+      </w:rPr>
+    </w:lvl>
+    <w:lvl w:ilvl="5" w:tentative="1">
+      <w:start w:val="1"/>
+      <w:numFmt w:val="bullet"/>
+      <w:lvlText w:val=""/>
+      <w:lvlJc w:val="left"/>
+      <w:pPr>
+        <w:tabs>
+          <w:tab w:val="num" w:pos="4320"/>
+        </w:tabs>
+        <w:ind w:left="4320" w:hanging="360"/>
+      </w:pPr>
+      <w:rPr>
+        <w:rFonts w:ascii="Wingdings" w:hAnsi="Wingdings" w:hint="default"/>
+        <w:sz w:val="20"/>
+      </w:rPr>
+    </w:lvl>
+    <w:lvl w:ilvl="6" w:tentative="1">
+      <w:start w:val="1"/>
+      <w:numFmt w:val="bullet"/>
+      <w:lvlText w:val=""/>
+      <w:lvlJc w:val="left"/>
+      <w:pPr>
+        <w:tabs>
+          <w:tab w:val="num" w:pos="5040"/>
+        </w:tabs>
+        <w:ind w:left="5040" w:hanging="360"/>
+      </w:pPr>
+      <w:rPr>
+        <w:rFonts w:ascii="Wingdings" w:hAnsi="Wingdings" w:hint="default"/>
+        <w:sz w:val="20"/>
+      </w:rPr>
+    </w:lvl>
+    <w:lvl w:ilvl="7" w:tentative="1">
+      <w:start w:val="1"/>
+      <w:numFmt w:val="bullet"/>
+      <w:lvlText w:val=""/>
+      <w:lvlJc w:val="left"/>
+      <w:pPr>
+        <w:tabs>
+          <w:tab w:val="num" w:pos="5760"/>
+        </w:tabs>
+        <w:ind w:left="5760" w:hanging="360"/>
+      </w:pPr>
+      <w:rPr>
+        <w:rFonts w:ascii="Wingdings" w:hAnsi="Wingdings" w:hint="default"/>
+        <w:sz w:val="20"/>
+      </w:rPr>
+    </w:lvl>
+    <w:lvl w:ilvl="8" w:tentative="1">
+      <w:start w:val="1"/>
+      <w:numFmt w:val="bullet"/>
+      <w:lvlText w:val=""/>
+      <w:lvlJc w:val="left"/>
+      <w:pPr>
+        <w:tabs>
+          <w:tab w:val="num" w:pos="6480"/>
+        </w:tabs>
+        <w:ind w:left="6480" w:hanging="360"/>
+      </w:pPr>
+      <w:rPr>
+        <w:rFonts w:ascii="Wingdings" w:hAnsi="Wingdings" w:hint="default"/>
+        <w:sz w:val="20"/>
+      </w:rPr>
+    </w:lvl>
+  </w:abstractNum>
+  <w:abstractNum w:abstractNumId="13" w15:restartNumberingAfterBreak="0">
+    <w:nsid w:val="78A51C35"/>
+    <w:multiLevelType w:val="multilevel"/>
+    <w:tmpl w:val="C870EC56"/>
+    <w:lvl w:ilvl="0">
+      <w:start w:val="1"/>
+      <w:numFmt w:val="bullet"/>
+      <w:lvlText w:val=""/>
+      <w:lvlJc w:val="left"/>
+      <w:pPr>
+        <w:tabs>
+          <w:tab w:val="num" w:pos="720"/>
+        </w:tabs>
+        <w:ind w:left="720" w:hanging="360"/>
+      </w:pPr>
+      <w:rPr>
+        <w:rFonts w:ascii="Symbol" w:hAnsi="Symbol" w:hint="default"/>
+        <w:sz w:val="20"/>
+      </w:rPr>
+    </w:lvl>
+    <w:lvl w:ilvl="1" w:tentative="1">
+      <w:start w:val="1"/>
+      <w:numFmt w:val="bullet"/>
+      <w:lvlText w:val="o"/>
+      <w:lvlJc w:val="left"/>
+      <w:pPr>
+        <w:tabs>
+          <w:tab w:val="num" w:pos="1440"/>
+        </w:tabs>
+        <w:ind w:left="1440" w:hanging="360"/>
+      </w:pPr>
+      <w:rPr>
+        <w:rFonts w:ascii="Courier New" w:hAnsi="Courier New" w:hint="default"/>
+        <w:sz w:val="20"/>
+      </w:rPr>
+    </w:lvl>
+    <w:lvl w:ilvl="2" w:tentative="1">
+      <w:start w:val="1"/>
+      <w:numFmt w:val="bullet"/>
+      <w:lvlText w:val=""/>
+      <w:lvlJc w:val="left"/>
+      <w:pPr>
+        <w:tabs>
+          <w:tab w:val="num" w:pos="2160"/>
+        </w:tabs>
+        <w:ind w:left="2160" w:hanging="360"/>
+      </w:pPr>
+      <w:rPr>
+        <w:rFonts w:ascii="Wingdings" w:hAnsi="Wingdings" w:hint="default"/>
+        <w:sz w:val="20"/>
+      </w:rPr>
+    </w:lvl>
+    <w:lvl w:ilvl="3" w:tentative="1">
+      <w:start w:val="1"/>
+      <w:numFmt w:val="bullet"/>
+      <w:lvlText w:val=""/>
+      <w:lvlJc w:val="left"/>
+      <w:pPr>
+        <w:tabs>
+          <w:tab w:val="num" w:pos="2880"/>
+        </w:tabs>
+        <w:ind w:left="2880" w:hanging="360"/>
+      </w:pPr>
+      <w:rPr>
+        <w:rFonts w:ascii="Wingdings" w:hAnsi="Wingdings" w:hint="default"/>
+        <w:sz w:val="20"/>
+      </w:rPr>
+    </w:lvl>
+    <w:lvl w:ilvl="4" w:tentative="1">
+      <w:start w:val="1"/>
+      <w:numFmt w:val="bullet"/>
+      <w:lvlText w:val=""/>
+      <w:lvlJc w:val="left"/>
+      <w:pPr>
+        <w:tabs>
+          <w:tab w:val="num" w:pos="3600"/>
+        </w:tabs>
+        <w:ind w:left="3600" w:hanging="360"/>
+      </w:pPr>
+      <w:rPr>
+        <w:rFonts w:ascii="Wingdings" w:hAnsi="Wingdings" w:hint="default"/>
+        <w:sz w:val="20"/>
+      </w:rPr>
+    </w:lvl>
+    <w:lvl w:ilvl="5" w:tentative="1">
+      <w:start w:val="1"/>
+      <w:numFmt w:val="bullet"/>
+      <w:lvlText w:val=""/>
+      <w:lvlJc w:val="left"/>
+      <w:pPr>
+        <w:tabs>
+          <w:tab w:val="num" w:pos="4320"/>
+        </w:tabs>
+        <w:ind w:left="4320" w:hanging="360"/>
+      </w:pPr>
+      <w:rPr>
+        <w:rFonts w:ascii="Wingdings" w:hAnsi="Wingdings" w:hint="default"/>
+        <w:sz w:val="20"/>
+      </w:rPr>
+    </w:lvl>
+    <w:lvl w:ilvl="6" w:tentative="1">
+      <w:start w:val="1"/>
+      <w:numFmt w:val="bullet"/>
+      <w:lvlText w:val=""/>
+      <w:lvlJc w:val="left"/>
+      <w:pPr>
+        <w:tabs>
+          <w:tab w:val="num" w:pos="5040"/>
+        </w:tabs>
+        <w:ind w:left="5040" w:hanging="360"/>
+      </w:pPr>
+      <w:rPr>
+        <w:rFonts w:ascii="Wingdings" w:hAnsi="Wingdings" w:hint="default"/>
+        <w:sz w:val="20"/>
+      </w:rPr>
+    </w:lvl>
+    <w:lvl w:ilvl="7" w:tentative="1">
+      <w:start w:val="1"/>
+      <w:numFmt w:val="bullet"/>
+      <w:lvlText w:val=""/>
+      <w:lvlJc w:val="left"/>
+      <w:pPr>
+        <w:tabs>
+          <w:tab w:val="num" w:pos="5760"/>
+        </w:tabs>
+        <w:ind w:left="5760" w:hanging="360"/>
+      </w:pPr>
+      <w:rPr>
+        <w:rFonts w:ascii="Wingdings" w:hAnsi="Wingdings" w:hint="default"/>
+        <w:sz w:val="20"/>
+      </w:rPr>
+    </w:lvl>
+    <w:lvl w:ilvl="8" w:tentative="1">
+      <w:start w:val="1"/>
+      <w:numFmt w:val="bullet"/>
+      <w:lvlText w:val=""/>
+      <w:lvlJc w:val="left"/>
+      <w:pPr>
+        <w:tabs>
+          <w:tab w:val="num" w:pos="6480"/>
+        </w:tabs>
+        <w:ind w:left="6480" w:hanging="360"/>
+      </w:pPr>
+      <w:rPr>
+        <w:rFonts w:ascii="Wingdings" w:hAnsi="Wingdings" w:hint="default"/>
+        <w:sz w:val="20"/>
+      </w:rPr>
+    </w:lvl>
+  </w:abstractNum>
+  <w:abstractNum w:abstractNumId="14" w15:restartNumberingAfterBreak="0">
+    <w:nsid w:val="7B0075F3"/>
+    <w:multiLevelType w:val="multilevel"/>
+    <w:tmpl w:val="55DC471A"/>
+    <w:lvl w:ilvl="0">
+      <w:start w:val="1"/>
+      <w:numFmt w:val="bullet"/>
+      <w:lvlText w:val=""/>
+      <w:lvlJc w:val="left"/>
+      <w:pPr>
+        <w:tabs>
+          <w:tab w:val="num" w:pos="720"/>
+        </w:tabs>
+        <w:ind w:left="720" w:hanging="360"/>
+      </w:pPr>
+      <w:rPr>
+        <w:rFonts w:ascii="Symbol" w:hAnsi="Symbol" w:hint="default"/>
+        <w:sz w:val="20"/>
+      </w:rPr>
+    </w:lvl>
+    <w:lvl w:ilvl="1" w:tentative="1">
+      <w:start w:val="1"/>
+      <w:numFmt w:val="bullet"/>
+      <w:lvlText w:val="o"/>
+      <w:lvlJc w:val="left"/>
+      <w:pPr>
+        <w:tabs>
+          <w:tab w:val="num" w:pos="1440"/>
+        </w:tabs>
+        <w:ind w:left="1440" w:hanging="360"/>
+      </w:pPr>
+      <w:rPr>
+        <w:rFonts w:ascii="Courier New" w:hAnsi="Courier New" w:hint="default"/>
+        <w:sz w:val="20"/>
+      </w:rPr>
+    </w:lvl>
+    <w:lvl w:ilvl="2" w:tentative="1">
+      <w:start w:val="1"/>
+      <w:numFmt w:val="bullet"/>
+      <w:lvlText w:val=""/>
+      <w:lvlJc w:val="left"/>
+      <w:pPr>
+        <w:tabs>
+          <w:tab w:val="num" w:pos="2160"/>
+        </w:tabs>
+        <w:ind w:left="2160" w:hanging="360"/>
+      </w:pPr>
+      <w:rPr>
+        <w:rFonts w:ascii="Wingdings" w:hAnsi="Wingdings" w:hint="default"/>
+        <w:sz w:val="20"/>
+      </w:rPr>
+    </w:lvl>
+    <w:lvl w:ilvl="3" w:tentative="1">
+      <w:start w:val="1"/>
+      <w:numFmt w:val="bullet"/>
+      <w:lvlText w:val=""/>
+      <w:lvlJc w:val="left"/>
+      <w:pPr>
+        <w:tabs>
+          <w:tab w:val="num" w:pos="2880"/>
+        </w:tabs>
+        <w:ind w:left="2880" w:hanging="360"/>
+      </w:pPr>
+      <w:rPr>
+        <w:rFonts w:ascii="Wingdings" w:hAnsi="Wingdings" w:hint="default"/>
+        <w:sz w:val="20"/>
+      </w:rPr>
+    </w:lvl>
+    <w:lvl w:ilvl="4" w:tentative="1">
+      <w:start w:val="1"/>
+      <w:numFmt w:val="bullet"/>
+      <w:lvlText w:val=""/>
+      <w:lvlJc w:val="left"/>
+      <w:pPr>
+        <w:tabs>
+          <w:tab w:val="num" w:pos="3600"/>
+        </w:tabs>
+        <w:ind w:left="3600" w:hanging="360"/>
+      </w:pPr>
+      <w:rPr>
+        <w:rFonts w:ascii="Wingdings" w:hAnsi="Wingdings" w:hint="default"/>
+        <w:sz w:val="20"/>
+      </w:rPr>
+    </w:lvl>
+    <w:lvl w:ilvl="5" w:tentative="1">
+      <w:start w:val="1"/>
+      <w:numFmt w:val="bullet"/>
+      <w:lvlText w:val=""/>
+      <w:lvlJc w:val="left"/>
+      <w:pPr>
+        <w:tabs>
+          <w:tab w:val="num" w:pos="4320"/>
+        </w:tabs>
+        <w:ind w:left="4320" w:hanging="360"/>
+      </w:pPr>
+      <w:rPr>
+        <w:rFonts w:ascii="Wingdings" w:hAnsi="Wingdings" w:hint="default"/>
+        <w:sz w:val="20"/>
+      </w:rPr>
+    </w:lvl>
+    <w:lvl w:ilvl="6" w:tentative="1">
+      <w:start w:val="1"/>
+      <w:numFmt w:val="bullet"/>
+      <w:lvlText w:val=""/>
+      <w:lvlJc w:val="left"/>
+      <w:pPr>
+        <w:tabs>
+          <w:tab w:val="num" w:pos="5040"/>
+        </w:tabs>
+        <w:ind w:left="5040" w:hanging="360"/>
+      </w:pPr>
+      <w:rPr>
+        <w:rFonts w:ascii="Wingdings" w:hAnsi="Wingdings" w:hint="default"/>
+        <w:sz w:val="20"/>
+      </w:rPr>
+    </w:lvl>
+    <w:lvl w:ilvl="7" w:tentative="1">
+      <w:start w:val="1"/>
+      <w:numFmt w:val="bullet"/>
+      <w:lvlText w:val=""/>
+      <w:lvlJc w:val="left"/>
+      <w:pPr>
+        <w:tabs>
+          <w:tab w:val="num" w:pos="5760"/>
+        </w:tabs>
+        <w:ind w:left="5760" w:hanging="360"/>
+      </w:pPr>
+      <w:rPr>
+        <w:rFonts w:ascii="Wingdings" w:hAnsi="Wingdings" w:hint="default"/>
+        <w:sz w:val="20"/>
+      </w:rPr>
+    </w:lvl>
+    <w:lvl w:ilvl="8" w:tentative="1">
+      <w:start w:val="1"/>
+      <w:numFmt w:val="bullet"/>
+      <w:lvlText w:val=""/>
+      <w:lvlJc w:val="left"/>
+      <w:pPr>
+        <w:tabs>
+          <w:tab w:val="num" w:pos="6480"/>
+        </w:tabs>
+        <w:ind w:left="6480" w:hanging="360"/>
+      </w:pPr>
+      <w:rPr>
+        <w:rFonts w:ascii="Wingdings" w:hAnsi="Wingdings" w:hint="default"/>
+        <w:sz w:val="20"/>
+      </w:rPr>
+    </w:lvl>
+  </w:abstractNum>
+  <w:abstractNum w:abstractNumId="15" w15:restartNumberingAfterBreak="0">
+    <w:nsid w:val="7D1D19B9"/>
+    <w:multiLevelType w:val="multilevel"/>
+    <w:tmpl w:val="F3E40C66"/>
+    <w:lvl w:ilvl="0">
+      <w:start w:val="1"/>
+      <w:numFmt w:val="bullet"/>
+      <w:lvlText w:val=""/>
+      <w:lvlJc w:val="left"/>
+      <w:pPr>
+        <w:tabs>
+          <w:tab w:val="num" w:pos="720"/>
+        </w:tabs>
+        <w:ind w:left="720" w:hanging="360"/>
+      </w:pPr>
+      <w:rPr>
+        <w:rFonts w:ascii="Symbol" w:hAnsi="Symbol" w:hint="default"/>
+        <w:sz w:val="20"/>
+      </w:rPr>
+    </w:lvl>
+    <w:lvl w:ilvl="1" w:tentative="1">
+      <w:start w:val="1"/>
+      <w:numFmt w:val="bullet"/>
+      <w:lvlText w:val="o"/>
+      <w:lvlJc w:val="left"/>
+      <w:pPr>
+        <w:tabs>
+          <w:tab w:val="num" w:pos="1440"/>
+        </w:tabs>
+        <w:ind w:left="1440" w:hanging="360"/>
+      </w:pPr>
+      <w:rPr>
+        <w:rFonts w:ascii="Courier New" w:hAnsi="Courier New" w:hint="default"/>
+        <w:sz w:val="20"/>
+      </w:rPr>
+    </w:lvl>
+    <w:lvl w:ilvl="2" w:tentative="1">
+      <w:start w:val="1"/>
+      <w:numFmt w:val="bullet"/>
+      <w:lvlText w:val=""/>
+      <w:lvlJc w:val="left"/>
+      <w:pPr>
+        <w:tabs>
+          <w:tab w:val="num" w:pos="2160"/>
+        </w:tabs>
+        <w:ind w:left="2160" w:hanging="360"/>
+      </w:pPr>
+      <w:rPr>
+        <w:rFonts w:ascii="Wingdings" w:hAnsi="Wingdings" w:hint="default"/>
+        <w:sz w:val="20"/>
+      </w:rPr>
+    </w:lvl>
+    <w:lvl w:ilvl="3" w:tentative="1">
+      <w:start w:val="1"/>
+      <w:numFmt w:val="bullet"/>
+      <w:lvlText w:val=""/>
+      <w:lvlJc w:val="left"/>
+      <w:pPr>
+        <w:tabs>
+          <w:tab w:val="num" w:pos="2880"/>
+        </w:tabs>
+        <w:ind w:left="2880" w:hanging="360"/>
+      </w:pPr>
+      <w:rPr>
+        <w:rFonts w:ascii="Wingdings" w:hAnsi="Wingdings" w:hint="default"/>
+        <w:sz w:val="20"/>
+      </w:rPr>
+    </w:lvl>
+    <w:lvl w:ilvl="4" w:tentative="1">
+      <w:start w:val="1"/>
+      <w:numFmt w:val="bullet"/>
+      <w:lvlText w:val=""/>
+      <w:lvlJc w:val="left"/>
+      <w:pPr>
+        <w:tabs>
+          <w:tab w:val="num" w:pos="3600"/>
+        </w:tabs>
+        <w:ind w:left="3600" w:hanging="360"/>
+      </w:pPr>
+      <w:rPr>
+        <w:rFonts w:ascii="Wingdings" w:hAnsi="Wingdings" w:hint="default"/>
+        <w:sz w:val="20"/>
+      </w:rPr>
+    </w:lvl>
+    <w:lvl w:ilvl="5" w:tentative="1">
+      <w:start w:val="1"/>
+      <w:numFmt w:val="bullet"/>
+      <w:lvlText w:val=""/>
+      <w:lvlJc w:val="left"/>
+      <w:pPr>
+        <w:tabs>
+          <w:tab w:val="num" w:pos="4320"/>
+        </w:tabs>
+        <w:ind w:left="4320" w:hanging="360"/>
+      </w:pPr>
+      <w:rPr>
+        <w:rFonts w:ascii="Wingdings" w:hAnsi="Wingdings" w:hint="default"/>
+        <w:sz w:val="20"/>
+      </w:rPr>
+    </w:lvl>
+    <w:lvl w:ilvl="6" w:tentative="1">
+      <w:start w:val="1"/>
+      <w:numFmt w:val="bullet"/>
+      <w:lvlText w:val=""/>
+      <w:lvlJc w:val="left"/>
+      <w:pPr>
+        <w:tabs>
+          <w:tab w:val="num" w:pos="5040"/>
+        </w:tabs>
+        <w:ind w:left="5040" w:hanging="360"/>
+      </w:pPr>
+      <w:rPr>
+        <w:rFonts w:ascii="Wingdings" w:hAnsi="Wingdings" w:hint="default"/>
+        <w:sz w:val="20"/>
+      </w:rPr>
+    </w:lvl>
+    <w:lvl w:ilvl="7" w:tentative="1">
+      <w:start w:val="1"/>
+      <w:numFmt w:val="bullet"/>
+      <w:lvlText w:val=""/>
+      <w:lvlJc w:val="left"/>
+      <w:pPr>
+        <w:tabs>
+          <w:tab w:val="num" w:pos="5760"/>
+        </w:tabs>
+        <w:ind w:left="5760" w:hanging="360"/>
+      </w:pPr>
+      <w:rPr>
+        <w:rFonts w:ascii="Wingdings" w:hAnsi="Wingdings" w:hint="default"/>
+        <w:sz w:val="20"/>
+      </w:rPr>
+    </w:lvl>
+    <w:lvl w:ilvl="8" w:tentative="1">
+      <w:start w:val="1"/>
+      <w:numFmt w:val="bullet"/>
+      <w:lvlText w:val=""/>
+      <w:lvlJc w:val="left"/>
+      <w:pPr>
+        <w:tabs>
+          <w:tab w:val="num" w:pos="6480"/>
+        </w:tabs>
+        <w:ind w:left="6480" w:hanging="360"/>
+      </w:pPr>
+      <w:rPr>
+        <w:rFonts w:ascii="Wingdings" w:hAnsi="Wingdings" w:hint="default"/>
+        <w:sz w:val="20"/>
+      </w:rPr>
+    </w:lvl>
+  </w:abstractNum>
   <w:num w:numId="1" w16cid:durableId="1919292634">
+    <w:abstractNumId w:val="3"/>
+  </w:num>
+  <w:num w:numId="2" w16cid:durableId="1284189405">
+    <w:abstractNumId w:val="7"/>
+  </w:num>
+  <w:num w:numId="3" w16cid:durableId="619918352">
+    <w:abstractNumId w:val="8"/>
+  </w:num>
+  <w:num w:numId="4" w16cid:durableId="247932576">
+    <w:abstractNumId w:val="11"/>
+  </w:num>
+  <w:num w:numId="5" w16cid:durableId="1678843771">
+    <w:abstractNumId w:val="10"/>
+  </w:num>
+  <w:num w:numId="6" w16cid:durableId="197013584">
+    <w:abstractNumId w:val="2"/>
+  </w:num>
+  <w:num w:numId="7" w16cid:durableId="1022631647">
+    <w:abstractNumId w:val="6"/>
+  </w:num>
+  <w:num w:numId="8" w16cid:durableId="707605967">
+    <w:abstractNumId w:val="0"/>
+  </w:num>
+  <w:num w:numId="9" w16cid:durableId="901403781">
+    <w:abstractNumId w:val="12"/>
+  </w:num>
+  <w:num w:numId="10" w16cid:durableId="370034008">
+    <w:abstractNumId w:val="5"/>
+  </w:num>
+  <w:num w:numId="11" w16cid:durableId="870648711">
+    <w:abstractNumId w:val="13"/>
+  </w:num>
+  <w:num w:numId="12" w16cid:durableId="285548063">
+    <w:abstractNumId w:val="14"/>
+  </w:num>
+  <w:num w:numId="13" w16cid:durableId="482695199">
     <w:abstractNumId w:val="1"/>
   </w:num>
-  <w:num w:numId="2" w16cid:durableId="1284189405">
-    <w:abstractNumId w:val="2"/>
+  <w:num w:numId="14" w16cid:durableId="1952007650">
+    <w:abstractNumId w:val="9"/>
   </w:num>
-  <w:num w:numId="3" w16cid:durableId="619918352">
-    <w:abstractNumId w:val="3"/>
-  </w:num>
-  <w:num w:numId="4" w16cid:durableId="247932576">
-    <w:abstractNumId w:val="5"/>
-  </w:num>
-  <w:num w:numId="5" w16cid:durableId="1678843771">
+  <w:num w:numId="15" w16cid:durableId="246499032">
     <w:abstractNumId w:val="4"/>
   </w:num>
-  <w:num w:numId="6" w16cid:durableId="197013584">
-    <w:abstractNumId w:val="0"/>
+  <w:num w:numId="16" w16cid:durableId="2096246268">
+    <w:abstractNumId w:val="15"/>
   </w:num>
 </w:numbering>
 </file>
@@ -4777,7 +6582,6 @@
   <w:style w:type="character" w:default="1" w:styleId="DefaultParagraphFont">
     <w:name w:val="Default Paragraph Font"/>
     <w:uiPriority w:val="1"/>
-    <w:semiHidden/>
     <w:unhideWhenUsed/>
   </w:style>
   <w:style w:type="table" w:default="1" w:styleId="TableNormal">
@@ -5091,6 +6895,41 @@
       <w:spacing w:val="5"/>
     </w:rPr>
   </w:style>
+  <w:style w:type="character" w:styleId="Hyperlink">
+    <w:name w:val="Hyperlink"/>
+    <w:basedOn w:val="DefaultParagraphFont"/>
+    <w:uiPriority w:val="99"/>
+    <w:unhideWhenUsed/>
+    <w:rsid w:val="004F1FA2"/>
+    <w:rPr>
+      <w:color w:val="467886" w:themeColor="hyperlink"/>
+      <w:u w:val="single"/>
+    </w:rPr>
+  </w:style>
+  <w:style w:type="character" w:styleId="UnresolvedMention">
+    <w:name w:val="Unresolved Mention"/>
+    <w:basedOn w:val="DefaultParagraphFont"/>
+    <w:uiPriority w:val="99"/>
+    <w:semiHidden/>
+    <w:unhideWhenUsed/>
+    <w:rsid w:val="004F1FA2"/>
+    <w:rPr>
+      <w:color w:val="605E5C"/>
+      <w:shd w:val="clear" w:color="auto" w:fill="E1DFDD"/>
+    </w:rPr>
+  </w:style>
+  <w:style w:type="character" w:styleId="FollowedHyperlink">
+    <w:name w:val="FollowedHyperlink"/>
+    <w:basedOn w:val="DefaultParagraphFont"/>
+    <w:uiPriority w:val="99"/>
+    <w:semiHidden/>
+    <w:unhideWhenUsed/>
+    <w:rsid w:val="005E57DF"/>
+    <w:rPr>
+      <w:color w:val="96607D" w:themeColor="followedHyperlink"/>
+      <w:u w:val="single"/>
+    </w:rPr>
+  </w:style>
 </w:styles>
 </file>
 

</xml_diff>